<commit_message>
Resume: Cyber Security Internships: 26+ Cyber Security Intern Jobs @ Unknown (unknown)
</commit_message>
<xml_diff>
--- a/resumes/Resume_Cyber_Security_Internships__26__Cyb_Unknown__unknown_.docx
+++ b/resumes/Resume_Cyber_Security_Internships__26__Cyb_Unknown__unknown_.docx
@@ -117,7 +117,7 @@
         <w:pBdr>
           <w:bottom w:val="single" w:sz="6" w:space="1" w:color="000000"/>
         </w:pBdr>
-        <w:spacing w:before="112" w:after="0"/>
+        <w:spacing w:before="99" w:after="0"/>
       </w:pPr>
       <w:r>
         <w:rPr>
@@ -289,7 +289,7 @@
     </w:p>
     <w:p>
       <w:pPr>
-        <w:spacing w:before="23" w:after="23"/>
+        <w:spacing w:before="20" w:after="20"/>
       </w:pPr>
     </w:p>
     <w:p>
@@ -297,7 +297,7 @@
         <w:pBdr>
           <w:bottom w:val="single" w:sz="6" w:space="1" w:color="000000"/>
         </w:pBdr>
-        <w:spacing w:before="112" w:after="0"/>
+        <w:spacing w:before="99" w:after="0"/>
       </w:pPr>
       <w:r>
         <w:rPr>
@@ -404,16 +404,34 @@
           <w:ilvl w:val="0"/>
           <w:numId w:val="2"/>
         </w:numPr>
-        <w:spacing w:before="13" w:after="32"/>
-      </w:pPr>
-      <w:r>
-        <w:rPr>
-          <w:rFonts w:ascii="Source Sans Pro" w:eastAsia="Source Sans Pro" w:hAnsi="Source Sans Pro" w:cs="Source Sans Pro"/>
-          <w:color w:val="000000"/>
-          <w:sz w:val="19"/>
-          <w:szCs w:val="19"/>
-        </w:rPr>
-        <w:t>Triaged 50+ weekly inventory reimbursement cases by severity and policy eligibility, following structured case triage and escalation workflows, resulting in timely and accurate decision-making.</w:t>
+        <w:spacing w:before="13" w:after="30"/>
+      </w:pPr>
+      <w:r>
+        <w:rPr>
+          <w:rFonts w:ascii="Source Sans Pro" w:eastAsia="Source Sans Pro" w:hAnsi="Source Sans Pro" w:cs="Source Sans Pro"/>
+          <w:color w:val="000000"/>
+          <w:sz w:val="19"/>
+          <w:szCs w:val="19"/>
+        </w:rPr>
+        <w:t>Triaged 50+ weekly inventory reimbursement cases by severity and policy eligibility, following structured case triage and escalation workflows, resulting in timely decision-making.</w:t>
+      </w:r>
+      <w:proofErr w:type="spellStart"/>
+      <w:r>
+        <w:rPr>
+          <w:rFonts w:ascii="Source Sans Pro" w:eastAsia="Source Sans Pro" w:hAnsi="Source Sans Pro" w:cs="Source Sans Pro"/>
+          <w:color w:val="000000"/>
+          <w:sz w:val="19"/>
+          <w:szCs w:val="19"/>
+        </w:rPr>
+      </w:r>
+      <w:proofErr w:type="spellEnd"/>
+      <w:r>
+        <w:rPr>
+          <w:rFonts w:ascii="Source Sans Pro" w:eastAsia="Source Sans Pro" w:hAnsi="Source Sans Pro" w:cs="Source Sans Pro"/>
+          <w:color w:val="000000"/>
+          <w:sz w:val="19"/>
+          <w:szCs w:val="19"/>
+        </w:rPr>
       </w:r>
     </w:p>
     <w:p>
@@ -423,7 +441,7 @@
           <w:ilvl w:val="0"/>
           <w:numId w:val="2"/>
         </w:numPr>
-        <w:spacing w:before="13" w:after="32"/>
+        <w:spacing w:before="13" w:after="30"/>
       </w:pPr>
       <w:r>
         <w:rPr>
@@ -442,16 +460,16 @@
           <w:ilvl w:val="0"/>
           <w:numId w:val="2"/>
         </w:numPr>
-        <w:spacing w:before="13" w:after="32"/>
-      </w:pPr>
-      <w:r>
-        <w:rPr>
-          <w:rFonts w:ascii="Source Sans Pro" w:eastAsia="Source Sans Pro" w:hAnsi="Source Sans Pro" w:cs="Source Sans Pro"/>
-          <w:color w:val="000000"/>
-          <w:sz w:val="19"/>
-          <w:szCs w:val="19"/>
-        </w:rPr>
-        <w:t>Analyzed 200+ weekly cases to spot recurring fraud patterns, flagging them early to reduce repeat-issue investigation time before escalation, resulting in efficient issue resolution.</w:t>
+        <w:spacing w:before="13" w:after="30"/>
+      </w:pPr>
+      <w:r>
+        <w:rPr>
+          <w:rFonts w:ascii="Source Sans Pro" w:eastAsia="Source Sans Pro" w:hAnsi="Source Sans Pro" w:cs="Source Sans Pro"/>
+          <w:color w:val="000000"/>
+          <w:sz w:val="19"/>
+          <w:szCs w:val="19"/>
+        </w:rPr>
+        <w:t>Analyzed 200+ weekly cases for recurring fraud patterns, detecting anomalies early and reducing repeat-issue investigation time before escalation, resulting in efficient case resolution.</w:t>
       </w:r>
     </w:p>
     <w:p>
@@ -461,21 +479,24 @@
           <w:ilvl w:val="0"/>
           <w:numId w:val="2"/>
         </w:numPr>
-        <w:spacing w:before="13" w:after="32"/>
-      </w:pPr>
-      <w:r>
-        <w:rPr>
-          <w:rFonts w:ascii="Source Sans Pro" w:eastAsia="Source Sans Pro" w:hAnsi="Source Sans Pro" w:cs="Source Sans Pro"/>
-          <w:color w:val="000000"/>
-          <w:sz w:val="19"/>
-          <w:szCs w:val="19"/>
-        </w:rPr>
-        <w:t>Documented audit-ready case records, capturing investigation findings, decisions, evidence notes, and corrective actions, ensuring transparent and accountable case management.</w:t>
-      </w:r>
-    </w:p>
-    <w:p>
-      <w:pPr>
-        <w:spacing w:before="23" w:after="23"/>
+        <w:spacing w:before="13" w:after="30"/>
+      </w:pPr>
+      <w:r>
+        <w:rPr>
+          <w:rFonts w:ascii="Source Sans Pro" w:eastAsia="Source Sans Pro" w:hAnsi="Source Sans Pro" w:cs="Source Sans Pro"/>
+          <w:color w:val="000000"/>
+          <w:sz w:val="19"/>
+          <w:szCs w:val="19"/>
+        </w:rPr>
+        <w:t>Documented investigation findings, decisions, evidence notes, and corrective actions in audit-ready case records, ensuring transparency and accountability in case management.</w:t>
+      </w:r>
+    </w:p>
+    <w:p>
+      <w:pPr>
+        <w:pBdr>
+          <w:bottom w:val="single" w:sz="6" w:space="1" w:color="000000"/>
+        </w:pBdr>
+        <w:spacing w:before="20" w:after="20"/>
         <w:rPr>
           <w:rFonts w:ascii="Source Sans Pro" w:eastAsia="Source Sans Pro" w:hAnsi="Source Sans Pro" w:cs="Source Sans Pro"/>
           <w:b/>
@@ -488,7 +509,10 @@
     </w:p>
     <w:p>
       <w:pPr>
-        <w:spacing w:before="105" w:after="13"/>
+        <w:pBdr>
+          <w:bottom w:val="single" w:sz="6" w:space="1" w:color="000000"/>
+        </w:pBdr>
+        <w:spacing w:before="99" w:after="0"/>
       </w:pPr>
       <w:r>
         <w:rPr>
@@ -509,14 +533,16 @@
         </w:tabs>
         <w:spacing w:before="20" w:after="0"/>
       </w:pPr>
-      <w:hyperlink r:id="rId8">
+      <w:proofErr w:type="spellStart"/>
+      <w:proofErr w:type="spellEnd"/>
+      <w:hyperlink r:id="rId13">
         <w:r>
           <w:rPr>
             <w:rFonts w:ascii="Source Sans Pro" w:eastAsia="Source Sans Pro" w:hAnsi="Source Sans Pro" w:cs="Source Sans Pro"/>
             <w:b/>
-            <w:color w:val="000000"/>
             <w:sz w:val="19"/>
             <w:szCs w:val="19"/>
+            <w:color w:val="000000"/>
             <w:u w:val="single"/>
           </w:rPr>
           <w:t>SOC Automation and Threat Detection Lab</w:t>
@@ -528,15 +554,7 @@
           <w:sz w:val="19"/>
           <w:szCs w:val="19"/>
         </w:rPr>
-        <w:t xml:space="preserve">  |  </w:t>
-      </w:r>
-      <w:r>
-        <w:rPr>
-          <w:rFonts w:ascii="Source Sans Pro" w:eastAsia="Source Sans Pro" w:hAnsi="Source Sans Pro" w:cs="Source Sans Pro"/>
-          <w:sz w:val="19"/>
-          <w:szCs w:val="19"/>
-        </w:rPr>
-        <w:tab/>
+        <w:t xml:space="preserve">  |  	</w:t>
       </w:r>
       <w:r>
         <w:rPr>
@@ -555,16 +573,16 @@
           <w:ilvl w:val="0"/>
           <w:numId w:val="2"/>
         </w:numPr>
-        <w:spacing w:before="13" w:after="32"/>
-      </w:pPr>
-      <w:r>
-        <w:rPr>
-          <w:rFonts w:ascii="Source Sans Pro" w:eastAsia="Source Sans Pro" w:hAnsi="Source Sans Pro" w:cs="Source Sans Pro"/>
-          <w:color w:val="000000"/>
-          <w:sz w:val="19"/>
-          <w:szCs w:val="19"/>
-        </w:rPr>
-        <w:t>Deployed Splunk SIEM with SPL searches for brute-force detection, lateral movement, and privilege escalation; mapped TTPs to MITRE ATT&amp;CK and wrote PICERL incident report using Python, Splunk, and Wireshark.</w:t>
+        <w:spacing w:before="13" w:after="30"/>
+      </w:pPr>
+      <w:r>
+        <w:rPr>
+          <w:rFonts w:ascii="Source Sans Pro" w:eastAsia="Source Sans Pro" w:hAnsi="Source Sans Pro" w:cs="Source Sans Pro"/>
+          <w:color w:val="000000"/>
+          <w:sz w:val="19"/>
+          <w:szCs w:val="19"/>
+        </w:rPr>
+        <w:t>Deployed Splunk SIEM with SPL correlation searches for brute-force detection, lateral movement, and privilege escalation, mapped to MITRE ATT&amp;CK TTPs and wrote PICERL incident report.</w:t>
       </w:r>
     </w:p>
     <w:p>
@@ -574,16 +592,16 @@
           <w:ilvl w:val="0"/>
           <w:numId w:val="2"/>
         </w:numPr>
-        <w:spacing w:before="13" w:after="32"/>
-      </w:pPr>
-      <w:r>
-        <w:rPr>
-          <w:rFonts w:ascii="Source Sans Pro" w:eastAsia="Source Sans Pro" w:hAnsi="Source Sans Pro" w:cs="Source Sans Pro"/>
-          <w:color w:val="000000"/>
-          <w:sz w:val="19"/>
-          <w:szCs w:val="19"/>
-        </w:rPr>
-        <w:t>Developed SOAR-style detection pipeline: ingested Splunk alerts, enriched with VirusTotal IOC data, and dispatched Telegram notifications with severity classification.</w:t>
+        <w:spacing w:before="13" w:after="30"/>
+      </w:pPr>
+      <w:r>
+        <w:rPr>
+          <w:rFonts w:ascii="Source Sans Pro" w:eastAsia="Source Sans Pro" w:hAnsi="Source Sans Pro" w:cs="Source Sans Pro"/>
+          <w:color w:val="000000"/>
+          <w:sz w:val="19"/>
+          <w:szCs w:val="19"/>
+        </w:rPr>
+        <w:t>Developed SOAR-style detection pipeline: Python script ingests Splunk alerts, enriches with VirusTotal API, and dispatches Telegram notifications with severity classification.</w:t>
       </w:r>
     </w:p>
     <w:p>
@@ -593,7 +611,7 @@
           <w:ilvl w:val="0"/>
           <w:numId w:val="2"/>
         </w:numPr>
-        <w:spacing w:before="13" w:after="32"/>
+        <w:spacing w:before="13" w:after="30"/>
       </w:pPr>
       <w:r>
         <w:rPr>
@@ -604,10 +622,46 @@
         </w:rPr>
         <w:t>Converted detection logic to Sigma rules; analyzed TCP/IP traffic in Wireshark for SYN scans, DNS tunnelling, and plaintext credential exposure.</w:t>
       </w:r>
-    </w:p>
-    <w:p>
-      <w:pPr>
-        <w:spacing w:before="23" w:after="23"/>
+      <w:proofErr w:type="spellStart"/>
+      <w:r>
+        <w:rPr>
+          <w:rFonts w:ascii="Source Sans Pro" w:eastAsia="Source Sans Pro" w:hAnsi="Source Sans Pro" w:cs="Source Sans Pro"/>
+          <w:color w:val="000000"/>
+          <w:sz w:val="19"/>
+          <w:szCs w:val="19"/>
+        </w:rPr>
+      </w:r>
+      <w:proofErr w:type="spellEnd"/>
+      <w:r>
+        <w:rPr>
+          <w:rFonts w:ascii="Source Sans Pro" w:eastAsia="Source Sans Pro" w:hAnsi="Source Sans Pro" w:cs="Source Sans Pro"/>
+          <w:color w:val="000000"/>
+          <w:sz w:val="19"/>
+          <w:szCs w:val="19"/>
+        </w:rPr>
+      </w:r>
+      <w:proofErr w:type="spellStart"/>
+      <w:r>
+        <w:rPr>
+          <w:rFonts w:ascii="Source Sans Pro" w:eastAsia="Source Sans Pro" w:hAnsi="Source Sans Pro" w:cs="Source Sans Pro"/>
+          <w:color w:val="000000"/>
+          <w:sz w:val="19"/>
+          <w:szCs w:val="19"/>
+        </w:rPr>
+      </w:r>
+      <w:proofErr w:type="spellEnd"/>
+      <w:r>
+        <w:rPr>
+          <w:rFonts w:ascii="Source Sans Pro" w:eastAsia="Source Sans Pro" w:hAnsi="Source Sans Pro" w:cs="Source Sans Pro"/>
+          <w:color w:val="000000"/>
+          <w:sz w:val="19"/>
+          <w:szCs w:val="19"/>
+        </w:rPr>
+      </w:r>
+    </w:p>
+    <w:p>
+      <w:pPr>
+        <w:spacing w:before="20" w:after="20"/>
       </w:pPr>
     </w:p>
     <w:p>
@@ -617,14 +671,14 @@
         </w:tabs>
         <w:spacing w:before="30" w:after="0"/>
       </w:pPr>
-      <w:hyperlink r:id="rId9">
+      <w:hyperlink r:id="rId14">
         <w:r>
           <w:rPr>
             <w:rFonts w:ascii="Source Sans Pro" w:eastAsia="Source Sans Pro" w:hAnsi="Source Sans Pro" w:cs="Source Sans Pro"/>
             <w:b/>
-            <w:color w:val="000000"/>
             <w:sz w:val="19"/>
             <w:szCs w:val="19"/>
+            <w:color w:val="000000"/>
             <w:u w:val="single"/>
           </w:rPr>
           <w:t>Vulnerability Scanner and Patch Prioritization Engine</w:t>
@@ -636,15 +690,7 @@
           <w:sz w:val="19"/>
           <w:szCs w:val="19"/>
         </w:rPr>
-        <w:t xml:space="preserve">  |  </w:t>
-      </w:r>
-      <w:r>
-        <w:rPr>
-          <w:rFonts w:ascii="Source Sans Pro" w:eastAsia="Source Sans Pro" w:hAnsi="Source Sans Pro" w:cs="Source Sans Pro"/>
-          <w:sz w:val="19"/>
-          <w:szCs w:val="19"/>
-        </w:rPr>
-        <w:tab/>
+        <w:t xml:space="preserve">  |  	</w:t>
       </w:r>
       <w:r>
         <w:rPr>
@@ -663,16 +709,16 @@
           <w:ilvl w:val="0"/>
           <w:numId w:val="2"/>
         </w:numPr>
-        <w:spacing w:before="13" w:after="32"/>
-      </w:pPr>
-      <w:r>
-        <w:rPr>
-          <w:rFonts w:ascii="Source Sans Pro" w:eastAsia="Source Sans Pro" w:hAnsi="Source Sans Pro" w:cs="Source Sans Pro"/>
-          <w:color w:val="000000"/>
-          <w:sz w:val="19"/>
-          <w:szCs w:val="19"/>
-        </w:rPr>
-        <w:t>Integrated Nessus and OpenVAS REST APIs in Python to generate CVE reports with CVSS severity and EPSS context from FIRST.org API.</w:t>
+        <w:spacing w:before="13" w:after="30"/>
+      </w:pPr>
+      <w:r>
+        <w:rPr>
+          <w:rFonts w:ascii="Source Sans Pro" w:eastAsia="Source Sans Pro" w:hAnsi="Source Sans Pro" w:cs="Source Sans Pro"/>
+          <w:color w:val="000000"/>
+          <w:sz w:val="19"/>
+          <w:szCs w:val="19"/>
+        </w:rPr>
+        <w:t>Developed automated vulnerability assessment pipeline integrating Nessus and OpenVAS REST APIs in Python, generating CVE reports with CVSS severity and EPSS context from FIRST.org API.</w:t>
       </w:r>
     </w:p>
     <w:p>
@@ -682,16 +728,16 @@
           <w:ilvl w:val="0"/>
           <w:numId w:val="2"/>
         </w:numPr>
-        <w:spacing w:before="13" w:after="32"/>
-      </w:pPr>
-      <w:r>
-        <w:rPr>
-          <w:rFonts w:ascii="Source Sans Pro" w:eastAsia="Source Sans Pro" w:hAnsi="Source Sans Pro" w:cs="Source Sans Pro"/>
-          <w:color w:val="000000"/>
-          <w:sz w:val="19"/>
-          <w:szCs w:val="19"/>
-        </w:rPr>
-        <w:t>Developed OWASP Top 10 automated web checker using Python, Bash, and NVD API to detect injection, auth, and SSRF vulnerabilities.</w:t>
+        <w:spacing w:before="13" w:after="30"/>
+      </w:pPr>
+      <w:r>
+        <w:rPr>
+          <w:rFonts w:ascii="Source Sans Pro" w:eastAsia="Source Sans Pro" w:hAnsi="Source Sans Pro" w:cs="Source Sans Pro"/>
+          <w:color w:val="000000"/>
+          <w:sz w:val="19"/>
+          <w:szCs w:val="19"/>
+        </w:rPr>
+        <w:t>Developed OWASP Top 10 automated web checker to detect injection, auth, and SSRF vulnerabilities; documented SQL injection exploit and remediation.</w:t>
       </w:r>
     </w:p>
     <w:p>
@@ -701,33 +747,24 @@
           <w:ilvl w:val="0"/>
           <w:numId w:val="2"/>
         </w:numPr>
-        <w:spacing w:before="13" w:after="32"/>
-      </w:pPr>
-      <w:r>
-        <w:rPr>
-          <w:rFonts w:ascii="Source Sans Pro" w:eastAsia="Source Sans Pro" w:hAnsi="Source Sans Pro" w:cs="Source Sans Pro"/>
-          <w:color w:val="000000"/>
-          <w:sz w:val="19"/>
-          <w:szCs w:val="19"/>
-        </w:rPr>
-        <w:t>Automated scan scheduling via Bash and cron; built delta-scan logic to flag new CVEs and track remediation using Bash, Nessus, and OpenVAS.</w:t>
-      </w:r>
-    </w:p>
-    <w:p>
-      <w:pPr>
-        <w:pStyle w:val="ListParagraph"/>
-        <w:spacing w:before="23" w:after="23"/>
-        <w:ind w:left="450"/>
-      </w:pPr>
+        <w:spacing w:before="13" w:after="30"/>
+      </w:pPr>
+      <w:r>
+        <w:rPr>
+          <w:rFonts w:ascii="Source Sans Pro" w:eastAsia="Source Sans Pro" w:hAnsi="Source Sans Pro" w:cs="Source Sans Pro"/>
+          <w:color w:val="000000"/>
+          <w:sz w:val="19"/>
+          <w:szCs w:val="19"/>
+        </w:rPr>
+        <w:t>Automated scan scheduling via Bash and cron; built delta-scan logic to flag newly discovered CVEs and organize patch compliance (remediation tracking) tracking evidence.</w:t>
+      </w:r>
     </w:p>
     <w:p>
       <w:pPr>
         <w:pBdr>
           <w:bottom w:val="single" w:sz="6" w:space="1" w:color="000000"/>
         </w:pBdr>
-        <w:spacing w:before="112" w:after="0"/>
-      </w:pPr>
-      <w:r>
+        <w:spacing w:before="20" w:after="20"/>
         <w:rPr>
           <w:rFonts w:ascii="Source Sans Pro" w:eastAsia="Source Sans Pro" w:hAnsi="Source Sans Pro" w:cs="Source Sans Pro"/>
           <w:b/>
@@ -736,125 +773,16 @@
           <w:sz w:val="22"/>
           <w:szCs w:val="22"/>
         </w:rPr>
-        <w:t>Technical Skills</w:t>
-      </w:r>
-    </w:p>
-    <w:p>
-      <w:pPr>
-        <w:spacing w:before="47" w:after="47"/>
-      </w:pPr>
-      <w:r>
-        <w:rPr>
-          <w:rFonts w:ascii="Source Sans Pro" w:eastAsia="Source Sans Pro" w:hAnsi="Source Sans Pro" w:cs="Source Sans Pro"/>
-          <w:b/>
-          <w:sz w:val="19"/>
-          <w:szCs w:val="19"/>
-        </w:rPr>
-        <w:t xml:space="preserve">SOC Operations: </w:t>
-      </w:r>
-      <w:r>
-        <w:rPr>
-          <w:rFonts w:ascii="Source Sans Pro" w:eastAsia="Source Sans Pro" w:hAnsi="Source Sans Pro" w:cs="Source Sans Pro"/>
-          <w:sz w:val="19"/>
-          <w:szCs w:val="19"/>
-        </w:rPr>
-        <w:t>Alert triage, incident investigation, log analysis, threat detection, escalation, false positive analysis</w:t>
-      </w:r>
-    </w:p>
-    <w:p>
-      <w:pPr>
-        <w:spacing w:before="47" w:after="47"/>
-      </w:pPr>
-      <w:r>
-        <w:rPr>
-          <w:rFonts w:ascii="Source Sans Pro" w:eastAsia="Source Sans Pro" w:hAnsi="Source Sans Pro" w:cs="Source Sans Pro"/>
-          <w:b/>
-          <w:sz w:val="19"/>
-          <w:szCs w:val="19"/>
-        </w:rPr>
-        <w:t xml:space="preserve">SIEM &amp; Monitoring: </w:t>
-      </w:r>
-      <w:r>
-        <w:rPr>
-          <w:rFonts w:ascii="Source Sans Pro" w:eastAsia="Source Sans Pro" w:hAnsi="Source Sans Pro" w:cs="Source Sans Pro"/>
-          <w:sz w:val="19"/>
-          <w:szCs w:val="19"/>
-        </w:rPr>
-        <w:t>Splunk (SPL), Elastic SIEM (basic), Windows Event Logs, Sysmon, Wireshark</w:t>
-      </w:r>
-    </w:p>
-    <w:p>
-      <w:pPr>
-        <w:spacing w:before="47" w:after="47"/>
-      </w:pPr>
-      <w:r>
-        <w:rPr>
-          <w:rFonts w:ascii="Source Sans Pro" w:eastAsia="Source Sans Pro" w:hAnsi="Source Sans Pro" w:cs="Source Sans Pro"/>
-          <w:b/>
-          <w:sz w:val="19"/>
-          <w:szCs w:val="19"/>
-        </w:rPr>
-        <w:t xml:space="preserve">Threat Intelligence: </w:t>
-      </w:r>
-      <w:r>
-        <w:rPr>
-          <w:rFonts w:ascii="Source Sans Pro" w:eastAsia="Source Sans Pro" w:hAnsi="Source Sans Pro" w:cs="Source Sans Pro"/>
-          <w:sz w:val="19"/>
-          <w:szCs w:val="19"/>
-        </w:rPr>
-        <w:t>MITRE ATT&amp;CK, IOC analysis, VirusTotal, OSINT enrichment, Cyber Kill Chain</w:t>
-      </w:r>
-    </w:p>
-    <w:p>
-      <w:pPr>
-        <w:spacing w:before="47" w:after="47"/>
-      </w:pPr>
-      <w:r>
-        <w:rPr>
-          <w:rFonts w:ascii="Source Sans Pro" w:eastAsia="Source Sans Pro" w:hAnsi="Source Sans Pro" w:cs="Source Sans Pro"/>
-          <w:b/>
-          <w:sz w:val="19"/>
-          <w:szCs w:val="19"/>
-        </w:rPr>
-        <w:t xml:space="preserve">Systems &amp; Networking: </w:t>
-      </w:r>
-      <w:r>
-        <w:rPr>
-          <w:rFonts w:ascii="Source Sans Pro" w:eastAsia="Source Sans Pro" w:hAnsi="Source Sans Pro" w:cs="Source Sans Pro"/>
-          <w:sz w:val="19"/>
-          <w:szCs w:val="19"/>
-        </w:rPr>
-        <w:t>Windows internals, Linux fundamentals, TCP/IP, DNS, HTTP/S, firewall and IDS/IPS concepts</w:t>
-      </w:r>
-    </w:p>
-    <w:p>
-      <w:pPr>
-        <w:spacing w:before="47" w:after="47"/>
-      </w:pPr>
-      <w:r>
-        <w:rPr>
-          <w:rFonts w:ascii="Source Sans Pro" w:eastAsia="Source Sans Pro" w:hAnsi="Source Sans Pro" w:cs="Source Sans Pro"/>
-          <w:b/>
-          <w:sz w:val="19"/>
-          <w:szCs w:val="19"/>
-        </w:rPr>
-        <w:t xml:space="preserve">Automation: </w:t>
-      </w:r>
-      <w:r>
-        <w:rPr>
-          <w:rFonts w:ascii="Source Sans Pro" w:eastAsia="Source Sans Pro" w:hAnsi="Source Sans Pro" w:cs="Source Sans Pro"/>
-          <w:sz w:val="19"/>
-          <w:szCs w:val="19"/>
-        </w:rPr>
-        <w:t>Python, Bash (basic), regular expressions, security</w:t>
-      </w:r>
+      </w:pPr>
     </w:p>
     <w:p>
       <w:pPr>
         <w:pBdr>
           <w:bottom w:val="single" w:sz="6" w:space="1" w:color="000000"/>
         </w:pBdr>
-        <w:spacing w:before="23" w:after="23"/>
+        <w:spacing w:before="99" w:after="0"/>
+      </w:pPr>
+      <w:r>
         <w:rPr>
           <w:rFonts w:ascii="Source Sans Pro" w:eastAsia="Source Sans Pro" w:hAnsi="Source Sans Pro" w:cs="Source Sans Pro"/>
           <w:b/>
@@ -863,14 +791,141 @@
           <w:sz w:val="22"/>
           <w:szCs w:val="22"/>
         </w:rPr>
-      </w:pPr>
+        <w:t>Technical Skills</w:t>
+      </w:r>
+    </w:p>
+    <w:p>
+      <w:pPr>
+        <w:spacing w:before="44" w:after="44"/>
+      </w:pPr>
+      <w:r>
+        <w:rPr>
+          <w:rFonts w:ascii="Source Sans Pro" w:eastAsia="Source Sans Pro" w:hAnsi="Source Sans Pro" w:cs="Source Sans Pro"/>
+          <w:b/>
+          <w:sz w:val="19"/>
+          <w:szCs w:val="19"/>
+        </w:rPr>
+        <w:t xml:space="preserve">SOC Operations: </w:t>
+      </w:r>
+      <w:r>
+        <w:rPr>
+          <w:rFonts w:ascii="Source Sans Pro" w:eastAsia="Source Sans Pro" w:hAnsi="Source Sans Pro" w:cs="Source Sans Pro"/>
+          <w:sz w:val="19"/>
+          <w:szCs w:val="19"/>
+        </w:rPr>
+        <w:t>Alert triage, incident investigation, log analysis, threat detection, escalation, false positive analysis</w:t>
+      </w:r>
+    </w:p>
+    <w:p>
+      <w:pPr>
+        <w:spacing w:before="44" w:after="44"/>
+      </w:pPr>
+      <w:r>
+        <w:rPr>
+          <w:rFonts w:ascii="Source Sans Pro" w:eastAsia="Source Sans Pro" w:hAnsi="Source Sans Pro" w:cs="Source Sans Pro"/>
+          <w:b/>
+          <w:sz w:val="19"/>
+          <w:szCs w:val="19"/>
+        </w:rPr>
+        <w:t xml:space="preserve">SIEM &amp; Monitoring: </w:t>
+      </w:r>
+      <w:r>
+        <w:rPr>
+          <w:rFonts w:ascii="Source Sans Pro" w:eastAsia="Source Sans Pro" w:hAnsi="Source Sans Pro" w:cs="Source Sans Pro"/>
+          <w:sz w:val="19"/>
+          <w:szCs w:val="19"/>
+        </w:rPr>
+        <w:t>Splunk (SPL), Elastic SIEM (basic), Windows Event Logs, Sysmon, Wireshark</w:t>
+      </w:r>
+    </w:p>
+    <w:p>
+      <w:pPr>
+        <w:spacing w:before="44" w:after="44"/>
+      </w:pPr>
+      <w:r>
+        <w:rPr>
+          <w:rFonts w:ascii="Source Sans Pro" w:eastAsia="Source Sans Pro" w:hAnsi="Source Sans Pro" w:cs="Source Sans Pro"/>
+          <w:b/>
+          <w:sz w:val="19"/>
+          <w:szCs w:val="19"/>
+        </w:rPr>
+        <w:t xml:space="preserve">Threat Intelligence: </w:t>
+      </w:r>
+      <w:r>
+        <w:rPr>
+          <w:rFonts w:ascii="Source Sans Pro" w:eastAsia="Source Sans Pro" w:hAnsi="Source Sans Pro" w:cs="Source Sans Pro"/>
+          <w:sz w:val="19"/>
+          <w:szCs w:val="19"/>
+        </w:rPr>
+        <w:t>MITRE ATT&amp;CK, IOC analysis, VirusTotal, OSINT enrichment, Cyber Kill Chain</w:t>
+      </w:r>
+    </w:p>
+    <w:p>
+      <w:pPr>
+        <w:spacing w:before="44" w:after="44"/>
+      </w:pPr>
+      <w:r>
+        <w:rPr>
+          <w:rFonts w:ascii="Source Sans Pro" w:eastAsia="Source Sans Pro" w:hAnsi="Source Sans Pro" w:cs="Source Sans Pro"/>
+          <w:b/>
+          <w:sz w:val="19"/>
+          <w:szCs w:val="19"/>
+        </w:rPr>
+        <w:t xml:space="preserve">Systems &amp; Networking: </w:t>
+      </w:r>
+      <w:r>
+        <w:rPr>
+          <w:rFonts w:ascii="Source Sans Pro" w:eastAsia="Source Sans Pro" w:hAnsi="Source Sans Pro" w:cs="Source Sans Pro"/>
+          <w:sz w:val="19"/>
+          <w:szCs w:val="19"/>
+        </w:rPr>
+        <w:t>Windows internals, Linux fundamentals, TCP/IP, DNS, HTTP/S, firewall and IDS/IPS concepts</w:t>
+      </w:r>
+    </w:p>
+    <w:p>
+      <w:pPr>
+        <w:spacing w:before="44" w:after="44"/>
+      </w:pPr>
+      <w:r>
+        <w:rPr>
+          <w:rFonts w:ascii="Source Sans Pro" w:eastAsia="Source Sans Pro" w:hAnsi="Source Sans Pro" w:cs="Source Sans Pro"/>
+          <w:b/>
+          <w:sz w:val="19"/>
+          <w:szCs w:val="19"/>
+        </w:rPr>
+        <w:t xml:space="preserve">Automation: </w:t>
+      </w:r>
+      <w:r>
+        <w:rPr>
+          <w:rFonts w:ascii="Source Sans Pro" w:eastAsia="Source Sans Pro" w:hAnsi="Source Sans Pro" w:cs="Source Sans Pro"/>
+          <w:sz w:val="19"/>
+          <w:szCs w:val="19"/>
+        </w:rPr>
+        <w:t>Python, Bash (basic), regular expressions, security</w:t>
+      </w:r>
     </w:p>
     <w:p>
       <w:pPr>
         <w:pBdr>
           <w:bottom w:val="single" w:sz="6" w:space="1" w:color="000000"/>
         </w:pBdr>
-        <w:spacing w:before="112" w:after="0"/>
+        <w:spacing w:before="20" w:after="20"/>
+        <w:rPr>
+          <w:rFonts w:ascii="Source Sans Pro" w:eastAsia="Source Sans Pro" w:hAnsi="Source Sans Pro" w:cs="Source Sans Pro"/>
+          <w:b/>
+          <w:bCs/>
+          <w:color w:val="000000"/>
+          <w:sz w:val="22"/>
+          <w:szCs w:val="22"/>
+        </w:rPr>
+      </w:pPr>
+    </w:p>
+    <w:p>
+      <w:pPr>
+        <w:pBdr>
+          <w:bottom w:val="single" w:sz="6" w:space="1" w:color="000000"/>
+        </w:pBdr>
+        <w:spacing w:before="99" w:after="0"/>
       </w:pPr>
       <w:r>
         <w:rPr>
@@ -891,7 +946,7 @@
           <w:ilvl w:val="0"/>
           <w:numId w:val="2"/>
         </w:numPr>
-        <w:spacing w:before="13" w:after="32"/>
+        <w:spacing w:before="13" w:after="30"/>
       </w:pPr>
       <w:r>
         <w:rPr>
@@ -910,7 +965,7 @@
           <w:ilvl w:val="0"/>
           <w:numId w:val="2"/>
         </w:numPr>
-        <w:spacing w:before="13" w:after="32"/>
+        <w:spacing w:before="13" w:after="30"/>
       </w:pPr>
       <w:r>
         <w:rPr>

</xml_diff>